<commit_message>
refactor: simplify Product schema using ProductID only
</commit_message>
<xml_diff>
--- a/docs/report/Bao_cao_Hoang_TV1.docx
+++ b/docs/report/Bao_cao_Hoang_TV1.docx
@@ -572,7 +572,7 @@
         <w:pStyle w:val="ListBullet"/>
       </w:pPr>
       <w:r>
-        <w:t>BR01: Quản lý danh mục Product với ProductID, ProductCode, ProductName, Category.</w:t>
+        <w:t>BR01: Quản lý danh mục Product với ProductID, ProductName, Category.</w:t>
       </w:r>
     </w:p>
     <w:p>
@@ -770,7 +770,7 @@
               <w:rPr>
                 <w:sz w:val="16"/>
               </w:rPr>
-              <w:t>ProductID PK, ProductCode UNIQUE</w:t>
+              <w:t>ProductID PK (mã định danh duy nhất)</w:t>
             </w:r>
           </w:p>
         </w:tc>

</xml_diff>